<commit_message>
changes in docker and kubernetes
</commit_message>
<xml_diff>
--- a/Kubernetes and Docker.docx
+++ b/Kubernetes and Docker.docx
@@ -37,13 +37,8 @@
       </w:r>
     </w:p>
     <w:p>
-      <w:proofErr w:type="gramStart"/>
-      <w:r>
-        <w:t>So</w:t>
-      </w:r>
-      <w:proofErr w:type="gramEnd"/>
-      <w:r>
-        <w:t xml:space="preserve"> we will give it some configuration to </w:t>
+      <w:r>
+        <w:t xml:space="preserve">So we will give it some configuration to </w:t>
       </w:r>
       <w:proofErr w:type="spellStart"/>
       <w:r>
@@ -57,7 +52,7 @@
     <w:p>
       <w:r>
         <w:pict w14:anchorId="3403210E">
-          <v:rect id="_x0000_i1091" style="width:0;height:1.5pt" o:hralign="center" o:hrstd="t" o:hr="t" fillcolor="#a0a0a0" stroked="f"/>
+          <v:rect id="_x0000_i1025" style="width:0;height:1.5pt" o:hralign="center" o:hrstd="t" o:hr="t" fillcolor="#a0a0a0" stroked="f"/>
         </w:pict>
       </w:r>
     </w:p>
@@ -90,7 +85,7 @@
     <w:p>
       <w:r>
         <w:pict w14:anchorId="7717EF8C">
-          <v:rect id="_x0000_i1092" style="width:0;height:1.5pt" o:hralign="center" o:hrstd="t" o:hr="t" fillcolor="#a0a0a0" stroked="f"/>
+          <v:rect id="_x0000_i1026" style="width:0;height:1.5pt" o:hralign="center" o:hrstd="t" o:hr="t" fillcolor="#a0a0a0" stroked="f"/>
         </w:pict>
       </w:r>
     </w:p>
@@ -123,7 +118,7 @@
     <w:p>
       <w:r>
         <w:pict w14:anchorId="6C4DC96A">
-          <v:rect id="_x0000_i1093" style="width:0;height:1.5pt" o:hralign="center" o:hrstd="t" o:hr="t" fillcolor="#a0a0a0" stroked="f"/>
+          <v:rect id="_x0000_i1027" style="width:0;height:1.5pt" o:hralign="center" o:hrstd="t" o:hr="t" fillcolor="#a0a0a0" stroked="f"/>
         </w:pict>
       </w:r>
     </w:p>
@@ -197,7 +192,7 @@
     <w:p>
       <w:r>
         <w:pict w14:anchorId="7F34D593">
-          <v:rect id="_x0000_i1094" style="width:0;height:1.5pt" o:hralign="center" o:hrstd="t" o:hr="t" fillcolor="#a0a0a0" stroked="f"/>
+          <v:rect id="_x0000_i1028" style="width:0;height:1.5pt" o:hralign="center" o:hrstd="t" o:hr="t" fillcolor="#a0a0a0" stroked="f"/>
         </w:pict>
       </w:r>
     </w:p>
@@ -285,7 +280,7 @@
     <w:p>
       <w:r>
         <w:pict w14:anchorId="28F2622A">
-          <v:rect id="_x0000_i1095" style="width:0;height:1.5pt" o:hralign="center" o:hrstd="t" o:hr="t" fillcolor="#a0a0a0" stroked="f"/>
+          <v:rect id="_x0000_i1029" style="width:0;height:1.5pt" o:hralign="center" o:hrstd="t" o:hr="t" fillcolor="#a0a0a0" stroked="f"/>
         </w:pict>
       </w:r>
     </w:p>
@@ -296,11 +291,27 @@
           <w:bCs/>
         </w:rPr>
       </w:pPr>
-      <w:r>
+    </w:p>
+    <w:p>
+      <w:pPr>
         <w:rPr>
           <w:b/>
           <w:bCs/>
         </w:rPr>
+      </w:pPr>
+    </w:p>
+    <w:p>
+      <w:pPr>
+        <w:rPr>
+          <w:b/>
+          <w:bCs/>
+        </w:rPr>
+      </w:pPr>
+      <w:r>
+        <w:rPr>
+          <w:b/>
+          <w:bCs/>
+        </w:rPr>
         <w:t>5. Nodes</w:t>
       </w:r>
     </w:p>
@@ -312,7 +323,6 @@
         </w:numPr>
       </w:pPr>
       <w:r>
-        <w:lastRenderedPageBreak/>
         <w:t>Physical or virtual machines that run applications.</w:t>
       </w:r>
     </w:p>
@@ -397,7 +407,7 @@
     <w:p>
       <w:r>
         <w:pict w14:anchorId="75AC9F2D">
-          <v:rect id="_x0000_i1096" style="width:0;height:1.5pt" o:hralign="center" o:hrstd="t" o:hr="t" fillcolor="#a0a0a0" stroked="f"/>
+          <v:rect id="_x0000_i1030" style="width:0;height:1.5pt" o:hralign="center" o:hrstd="t" o:hr="t" fillcolor="#a0a0a0" stroked="f"/>
         </w:pict>
       </w:r>
     </w:p>
@@ -459,7 +469,7 @@
     <w:p>
       <w:r>
         <w:pict w14:anchorId="7A636AD8">
-          <v:rect id="_x0000_i1097" style="width:0;height:1.5pt" o:hralign="center" o:hrstd="t" o:hr="t" fillcolor="#a0a0a0" stroked="f"/>
+          <v:rect id="_x0000_i1031" style="width:0;height:1.5pt" o:hralign="center" o:hrstd="t" o:hr="t" fillcolor="#a0a0a0" stroked="f"/>
         </w:pict>
       </w:r>
     </w:p>
@@ -519,7 +529,7 @@
     <w:p>
       <w:r>
         <w:pict w14:anchorId="5306D714">
-          <v:rect id="_x0000_i1098" style="width:0;height:1.5pt" o:hralign="center" o:hrstd="t" o:hr="t" fillcolor="#a0a0a0" stroked="f"/>
+          <v:rect id="_x0000_i1032" style="width:0;height:1.5pt" o:hralign="center" o:hrstd="t" o:hr="t" fillcolor="#a0a0a0" stroked="f"/>
         </w:pict>
       </w:r>
     </w:p>
@@ -563,7 +573,7 @@
     <w:p>
       <w:r>
         <w:pict w14:anchorId="487608C9">
-          <v:rect id="_x0000_i1099" style="width:0;height:1.5pt" o:hralign="center" o:hrstd="t" o:hr="t" fillcolor="#a0a0a0" stroked="f"/>
+          <v:rect id="_x0000_i1033" style="width:0;height:1.5pt" o:hralign="center" o:hrstd="t" o:hr="t" fillcolor="#a0a0a0" stroked="f"/>
         </w:pict>
       </w:r>
     </w:p>
@@ -621,7 +631,7 @@
     <w:p>
       <w:r>
         <w:pict w14:anchorId="733BDDC9">
-          <v:rect id="_x0000_i1100" style="width:0;height:1.5pt" o:hralign="center" o:hrstd="t" o:hr="t" fillcolor="#a0a0a0" stroked="f"/>
+          <v:rect id="_x0000_i1034" style="width:0;height:1.5pt" o:hralign="center" o:hrstd="t" o:hr="t" fillcolor="#a0a0a0" stroked="f"/>
         </w:pict>
       </w:r>
     </w:p>
@@ -632,27 +642,59 @@
           <w:bCs/>
         </w:rPr>
       </w:pPr>
-      <w:r>
+    </w:p>
+    <w:p>
+      <w:pPr>
         <w:rPr>
           <w:b/>
           <w:bCs/>
         </w:rPr>
-        <w:t xml:space="preserve">10. </w:t>
-      </w:r>
-      <w:proofErr w:type="spellStart"/>
-      <w:r>
+      </w:pPr>
+    </w:p>
+    <w:p>
+      <w:pPr>
         <w:rPr>
           <w:b/>
           <w:bCs/>
         </w:rPr>
-        <w:t>Minikube</w:t>
-      </w:r>
-      <w:proofErr w:type="spellEnd"/>
-      <w:r>
+      </w:pPr>
+    </w:p>
+    <w:p>
+      <w:pPr>
         <w:rPr>
           <w:b/>
           <w:bCs/>
         </w:rPr>
+      </w:pPr>
+    </w:p>
+    <w:p>
+      <w:pPr>
+        <w:rPr>
+          <w:b/>
+          <w:bCs/>
+        </w:rPr>
+      </w:pPr>
+      <w:r>
+        <w:rPr>
+          <w:b/>
+          <w:bCs/>
+        </w:rPr>
+        <w:t>10. M</w:t>
+      </w:r>
+      <w:proofErr w:type="spellStart"/>
+      <w:r>
+        <w:rPr>
+          <w:b/>
+          <w:bCs/>
+        </w:rPr>
+        <w:t>inikube</w:t>
+      </w:r>
+      <w:proofErr w:type="spellEnd"/>
+      <w:r>
+        <w:rPr>
+          <w:b/>
+          <w:bCs/>
+        </w:rPr>
         <w:t xml:space="preserve"> CLI Operations</w:t>
       </w:r>
     </w:p>
@@ -702,9 +744,8 @@
     </w:p>
     <w:p>
       <w:r>
-        <w:lastRenderedPageBreak/>
         <w:pict w14:anchorId="5AB84EE5">
-          <v:rect id="_x0000_i1101" style="width:0;height:1.5pt" o:hralign="center" o:hrstd="t" o:hr="t" fillcolor="#a0a0a0" stroked="f"/>
+          <v:rect id="_x0000_i1035" style="width:0;height:1.5pt" o:hralign="center" o:hrstd="t" o:hr="t" fillcolor="#a0a0a0" stroked="f"/>
         </w:pict>
       </w:r>
     </w:p>
@@ -871,6 +912,20 @@
           <w:lang w:val="en-US"/>
         </w:rPr>
       </w:pPr>
+    </w:p>
+    <w:p>
+      <w:pPr>
+        <w:rPr>
+          <w:lang w:val="en-US"/>
+        </w:rPr>
+      </w:pPr>
+    </w:p>
+    <w:p>
+      <w:pPr>
+        <w:rPr>
+          <w:lang w:val="en-US"/>
+        </w:rPr>
+      </w:pPr>
       <w:r>
         <w:rPr>
           <w:lang w:val="en-US"/>
@@ -896,7 +951,6 @@
         <w:t xml:space="preserve">From these files we need to the cluster about the different </w:t>
       </w:r>
       <w:proofErr w:type="spellStart"/>
-      <w:proofErr w:type="gramStart"/>
       <w:r>
         <w:rPr>
           <w:lang w:val="en-US"/>
@@ -904,7 +958,6 @@
         <w:t>Deployments,Pods</w:t>
       </w:r>
       <w:proofErr w:type="spellEnd"/>
-      <w:proofErr w:type="gramEnd"/>
       <w:r>
         <w:rPr>
           <w:lang w:val="en-US"/>
@@ -993,6 +1046,169 @@
           <w:lang w:val="en-US"/>
         </w:rPr>
       </w:pPr>
+    </w:p>
+    <w:p>
+      <w:pPr>
+        <w:rPr>
+          <w:lang w:val="en-US"/>
+        </w:rPr>
+      </w:pPr>
+    </w:p>
+    <w:p>
+      <w:pPr>
+        <w:rPr>
+          <w:lang w:val="en-US"/>
+        </w:rPr>
+      </w:pPr>
+    </w:p>
+    <w:p>
+      <w:pPr>
+        <w:rPr>
+          <w:lang w:val="en-US"/>
+        </w:rPr>
+      </w:pPr>
+    </w:p>
+    <w:p>
+      <w:pPr>
+        <w:rPr>
+          <w:lang w:val="en-US"/>
+        </w:rPr>
+      </w:pPr>
+    </w:p>
+    <w:p>
+      <w:pPr>
+        <w:rPr>
+          <w:lang w:val="en-US"/>
+        </w:rPr>
+      </w:pPr>
+    </w:p>
+    <w:p>
+      <w:pPr>
+        <w:rPr>
+          <w:lang w:val="en-US"/>
+        </w:rPr>
+      </w:pPr>
+    </w:p>
+    <w:p>
+      <w:pPr>
+        <w:rPr>
+          <w:lang w:val="en-US"/>
+        </w:rPr>
+      </w:pPr>
+    </w:p>
+    <w:p>
+      <w:pPr>
+        <w:rPr>
+          <w:lang w:val="en-US"/>
+        </w:rPr>
+      </w:pPr>
+    </w:p>
+    <w:p>
+      <w:pPr>
+        <w:rPr>
+          <w:lang w:val="en-US"/>
+        </w:rPr>
+      </w:pPr>
+      <w:r>
+        <w:rPr>
+          <w:lang w:val="en-US"/>
+        </w:rPr>
+        <w:t xml:space="preserve">Run the </w:t>
+      </w:r>
+      <w:proofErr w:type="spellStart"/>
+      <w:r>
+        <w:rPr>
+          <w:lang w:val="en-US"/>
+        </w:rPr>
+        <w:t>rabbitmq</w:t>
+      </w:r>
+      <w:proofErr w:type="spellEnd"/>
+      <w:r>
+        <w:rPr>
+          <w:lang w:val="en-US"/>
+        </w:rPr>
+        <w:t xml:space="preserve"> image</w:t>
+      </w:r>
+      <w:r>
+        <w:rPr>
+          <w:lang w:val="en-US"/>
+        </w:rPr>
+        <w:br/>
+      </w:r>
+      <w:r>
+        <w:rPr>
+          <w:lang w:val="en-US"/>
+        </w:rPr>
+        <w:t xml:space="preserve">docker run -it --rm --name </w:t>
+      </w:r>
+      <w:proofErr w:type="spellStart"/>
+      <w:r>
+        <w:rPr>
+          <w:lang w:val="en-US"/>
+        </w:rPr>
+        <w:t>rabbitmq</w:t>
+      </w:r>
+      <w:proofErr w:type="spellEnd"/>
+      <w:r>
+        <w:rPr>
+          <w:lang w:val="en-US"/>
+        </w:rPr>
+        <w:t xml:space="preserve"> \</w:t>
+      </w:r>
+    </w:p>
+    <w:p>
+      <w:pPr>
+        <w:rPr>
+          <w:lang w:val="en-US"/>
+        </w:rPr>
+      </w:pPr>
+      <w:r>
+        <w:rPr>
+          <w:lang w:val="en-US"/>
+        </w:rPr>
+        <w:t xml:space="preserve">  -p 5672:5672 -p 15672:15672 \</w:t>
+      </w:r>
+    </w:p>
+    <w:p>
+      <w:pPr>
+        <w:rPr>
+          <w:lang w:val="en-US"/>
+        </w:rPr>
+      </w:pPr>
+      <w:r>
+        <w:rPr>
+          <w:lang w:val="en-US"/>
+        </w:rPr>
+        <w:t xml:space="preserve">  your-</w:t>
+      </w:r>
+      <w:proofErr w:type="spellStart"/>
+      <w:r>
+        <w:rPr>
+          <w:lang w:val="en-US"/>
+        </w:rPr>
+        <w:t>dockerhub</w:t>
+      </w:r>
+      <w:proofErr w:type="spellEnd"/>
+      <w:r>
+        <w:rPr>
+          <w:lang w:val="en-US"/>
+        </w:rPr>
+        <w:t>-username/rabbitmq:3-management</w:t>
+      </w:r>
+    </w:p>
+    <w:p>
+      <w:pPr>
+        <w:rPr>
+          <w:lang w:val="en-US"/>
+        </w:rPr>
+      </w:pPr>
+    </w:p>
+    <w:p>
+      <w:pPr>
+        <w:rPr>
+          <w:lang w:val="en-US"/>
+        </w:rPr>
+      </w:pPr>
       <w:r>
         <w:rPr>
           <w:lang w:val="en-US"/>
@@ -1243,21 +1459,7 @@
         <w:rPr>
           <w:lang w:val="en-US"/>
         </w:rPr>
-        <w:t>Pick the id of the container and docker start -</w:t>
-      </w:r>
-      <w:proofErr w:type="gramStart"/>
-      <w:r>
-        <w:rPr>
-          <w:lang w:val="en-US"/>
-        </w:rPr>
-        <w:t>a</w:t>
-      </w:r>
-      <w:proofErr w:type="gramEnd"/>
-      <w:r>
-        <w:rPr>
-          <w:lang w:val="en-US"/>
-        </w:rPr>
-        <w:t xml:space="preserve"> id.</w:t>
+        <w:t>Pick the id of the container and docker start -a id.</w:t>
       </w:r>
     </w:p>
     <w:p>
@@ -3786,6 +3988,7 @@
   <w:style w:type="character" w:default="1" w:styleId="DefaultParagraphFont">
     <w:name w:val="Default Paragraph Font"/>
     <w:uiPriority w:val="1"/>
+    <w:semiHidden/>
     <w:unhideWhenUsed/>
   </w:style>
   <w:style w:type="table" w:default="1" w:styleId="TableNormal">

</xml_diff>